<commit_message>
Restrição: Não utilização do NavigationAgent2D
</commit_message>
<xml_diff>
--- a/Proposta/GDD_Backlog_SurviveGD.docx
+++ b/Proposta/GDD_Backlog_SurviveGD.docx
@@ -106,10 +106,7 @@
     </w:p>
     <w:p>
       <w:r>
-        <w:t xml:space="preserve">Movimentação </w:t>
-      </w:r>
-      <w:r>
-        <w:t>WASD.</w:t>
+        <w:t>Movimentação WASD.</w:t>
       </w:r>
     </w:p>
     <w:p>
@@ -242,15 +239,15 @@
           </w:tcPr>
           <w:p>
             <w:r>
-              <w:t xml:space="preserve">Entrada (Teclado / </w:t>
+              <w:t>Entrada (</w:t>
             </w:r>
             <w:proofErr w:type="spellStart"/>
             <w:r>
-              <w:t>Gamepad</w:t>
+              <w:t>Teclado</w:t>
             </w:r>
             <w:proofErr w:type="spellEnd"/>
             <w:r>
-              <w:t>)</w:t>
+              <w:t xml:space="preserve"> / Gamepad)</w:t>
             </w:r>
           </w:p>
         </w:tc>
@@ -271,7 +268,15 @@
             <w:tcW w:w="4320" w:type="dxa"/>
           </w:tcPr>
           <w:p>
-            <w:r>
+            <w:pPr>
+              <w:rPr>
+                <w:lang w:val="pt-BR"/>
+              </w:rPr>
+            </w:pPr>
+            <w:r>
+              <w:rPr>
+                <w:lang w:val="pt-BR"/>
+              </w:rPr>
               <w:t>W, A, S, D ou Setas / Analógico Esquerdo</w:t>
             </w:r>
           </w:p>
@@ -293,7 +298,15 @@
             <w:tcW w:w="4320" w:type="dxa"/>
           </w:tcPr>
           <w:p>
-            <w:r>
+            <w:pPr>
+              <w:rPr>
+                <w:lang w:val="pt-BR"/>
+              </w:rPr>
+            </w:pPr>
+            <w:r>
+              <w:rPr>
+                <w:lang w:val="pt-BR"/>
+              </w:rPr>
               <w:t>ESC / Tecla R / Botão Start</w:t>
             </w:r>
           </w:p>
@@ -397,36 +410,65 @@
             <w:tcW w:w="2880" w:type="dxa"/>
           </w:tcPr>
           <w:p>
-            <w:r>
+            <w:pPr>
+              <w:rPr>
+                <w:lang w:val="pt-BR"/>
+              </w:rPr>
+            </w:pPr>
+            <w:r>
+              <w:rPr>
+                <w:lang w:val="pt-BR"/>
+              </w:rPr>
               <w:t xml:space="preserve">Repositório </w:t>
             </w:r>
             <w:proofErr w:type="spellStart"/>
             <w:r>
+              <w:rPr>
+                <w:lang w:val="pt-BR"/>
+              </w:rPr>
               <w:t>Git</w:t>
             </w:r>
             <w:proofErr w:type="spellEnd"/>
             <w:r>
+              <w:rPr>
+                <w:lang w:val="pt-BR"/>
+              </w:rPr>
               <w:t xml:space="preserve"> </w:t>
             </w:r>
             <w:proofErr w:type="gramStart"/>
             <w:r>
+              <w:rPr>
+                <w:lang w:val="pt-BR"/>
+              </w:rPr>
               <w:t>com .</w:t>
             </w:r>
             <w:proofErr w:type="spellStart"/>
             <w:r>
+              <w:rPr>
+                <w:lang w:val="pt-BR"/>
+              </w:rPr>
               <w:t>gitignore</w:t>
             </w:r>
             <w:proofErr w:type="spellEnd"/>
             <w:proofErr w:type="gramEnd"/>
             <w:r>
+              <w:rPr>
+                <w:lang w:val="pt-BR"/>
+              </w:rPr>
               <w:t xml:space="preserve">, primeiro </w:t>
             </w:r>
             <w:proofErr w:type="spellStart"/>
             <w:r>
+              <w:rPr>
+                <w:lang w:val="pt-BR"/>
+              </w:rPr>
               <w:t>commit</w:t>
             </w:r>
             <w:proofErr w:type="spellEnd"/>
             <w:r>
+              <w:rPr>
+                <w:lang w:val="pt-BR"/>
+              </w:rPr>
               <w:t xml:space="preserve"> e projeto Godot criado.</w:t>
             </w:r>
           </w:p>
@@ -458,13 +500,16 @@
             <w:tcW w:w="2880" w:type="dxa"/>
           </w:tcPr>
           <w:p>
-            <w:proofErr w:type="spellStart"/>
-            <w:r>
-              <w:t>InputMap</w:t>
-            </w:r>
-            <w:proofErr w:type="spellEnd"/>
-            <w:r>
-              <w:t xml:space="preserve"> configurado, vetor normalizado e CharacterBody2D funcional.</w:t>
+            <w:pPr>
+              <w:rPr>
+                <w:lang w:val="pt-BR"/>
+              </w:rPr>
+            </w:pPr>
+            <w:r>
+              <w:rPr>
+                <w:lang w:val="pt-BR"/>
+              </w:rPr>
+              <w:t>InputMap configurado, vetor normalizado e CharacterBody2D funcional.</w:t>
             </w:r>
           </w:p>
         </w:tc>
@@ -495,16 +540,16 @@
             <w:tcW w:w="2880" w:type="dxa"/>
           </w:tcPr>
           <w:p>
-            <w:r>
-              <w:t xml:space="preserve">StaticBody2D limitando as bordas; </w:t>
-            </w:r>
-            <w:proofErr w:type="spellStart"/>
-            <w:r>
-              <w:t>hitbox</w:t>
-            </w:r>
-            <w:proofErr w:type="spellEnd"/>
-            <w:r>
-              <w:t xml:space="preserve"> contida na geometria.</w:t>
+            <w:pPr>
+              <w:rPr>
+                <w:lang w:val="pt-BR"/>
+              </w:rPr>
+            </w:pPr>
+            <w:r>
+              <w:rPr>
+                <w:lang w:val="pt-BR"/>
+              </w:rPr>
+              <w:t>StaticBody2D limitando as bordas; hitbox contida na geometria.</w:t>
             </w:r>
           </w:p>
         </w:tc>
@@ -535,16 +580,16 @@
             <w:tcW w:w="2880" w:type="dxa"/>
           </w:tcPr>
           <w:p>
-            <w:r>
-              <w:t>Variável caindo via _</w:t>
-            </w:r>
-            <w:proofErr w:type="spellStart"/>
-            <w:r>
-              <w:t>process</w:t>
-            </w:r>
-            <w:proofErr w:type="spellEnd"/>
-            <w:r>
-              <w:t>(delta) com bloqueio do input em 0.</w:t>
+            <w:pPr>
+              <w:rPr>
+                <w:lang w:val="pt-BR"/>
+              </w:rPr>
+            </w:pPr>
+            <w:r>
+              <w:rPr>
+                <w:lang w:val="pt-BR"/>
+              </w:rPr>
+              <w:t>Variável caindo via _process(delta) com bloqueio do input em 0.</w:t>
             </w:r>
           </w:p>
         </w:tc>
@@ -575,32 +620,44 @@
             <w:tcW w:w="2880" w:type="dxa"/>
           </w:tcPr>
           <w:p>
-            <w:r>
+            <w:pPr>
+              <w:rPr>
+                <w:lang w:val="pt-BR"/>
+              </w:rPr>
+            </w:pPr>
+            <w:r>
+              <w:rPr>
+                <w:lang w:val="pt-BR"/>
+              </w:rPr>
               <w:t xml:space="preserve">Area2D instanciado; detecta </w:t>
             </w:r>
             <w:proofErr w:type="spellStart"/>
             <w:r>
+              <w:rPr>
+                <w:lang w:val="pt-BR"/>
+              </w:rPr>
               <w:t>body_entered</w:t>
             </w:r>
             <w:proofErr w:type="spellEnd"/>
             <w:r>
+              <w:rPr>
+                <w:lang w:val="pt-BR"/>
+              </w:rPr>
               <w:t xml:space="preserve">, restaura variável e aplica </w:t>
             </w:r>
             <w:proofErr w:type="spellStart"/>
             <w:r>
-              <w:t>queue_</w:t>
-            </w:r>
-            <w:proofErr w:type="gramStart"/>
-            <w:r>
-              <w:t>free</w:t>
+              <w:rPr>
+                <w:lang w:val="pt-BR"/>
+              </w:rPr>
+              <w:t>queue_free</w:t>
             </w:r>
             <w:proofErr w:type="spellEnd"/>
             <w:r>
-              <w:t>(</w:t>
-            </w:r>
-            <w:proofErr w:type="gramEnd"/>
-            <w:r>
-              <w:t>).</w:t>
+              <w:rPr>
+                <w:lang w:val="pt-BR"/>
+              </w:rPr>
+              <w:t>().</w:t>
             </w:r>
           </w:p>
         </w:tc>
@@ -631,8 +688,30 @@
             <w:tcW w:w="2880" w:type="dxa"/>
           </w:tcPr>
           <w:p>
-            <w:r>
-              <w:t>NavigationAgent2D implementado; inimigo desvia de obstáculos da NavigationRegion2D.</w:t>
+            <w:pPr>
+              <w:rPr>
+                <w:lang w:val="pt-BR"/>
+              </w:rPr>
+            </w:pPr>
+            <w:r>
+              <w:rPr>
+                <w:lang w:val="pt-BR"/>
+              </w:rPr>
+              <w:t xml:space="preserve">O sistema de NavigationAgent2D não será utilizado; a perseguição será feita via cálculo de direção vetorial e </w:t>
+            </w:r>
+            <w:proofErr w:type="spellStart"/>
+            <w:r>
+              <w:rPr>
+                <w:lang w:val="pt-BR"/>
+              </w:rPr>
+              <w:t>move_and_slide</w:t>
+            </w:r>
+            <w:proofErr w:type="spellEnd"/>
+            <w:r>
+              <w:rPr>
+                <w:lang w:val="pt-BR"/>
+              </w:rPr>
+              <w:t>()</w:t>
             </w:r>
           </w:p>
         </w:tc>
@@ -653,31 +732,31 @@
             <w:tcW w:w="2880" w:type="dxa"/>
           </w:tcPr>
           <w:p>
-            <w:r>
-              <w:t xml:space="preserve">Gerenciador de </w:t>
-            </w:r>
             <w:proofErr w:type="spellStart"/>
             <w:r>
-              <w:t>Spawns</w:t>
+              <w:t>Gerenciador</w:t>
             </w:r>
             <w:proofErr w:type="spellEnd"/>
-          </w:p>
-        </w:tc>
-        <w:tc>
-          <w:tcPr>
-            <w:tcW w:w="2880" w:type="dxa"/>
-          </w:tcPr>
-          <w:p>
-            <w:r>
-              <w:t>Nó autônomo com Timer gera inimigos e itens em coordenadas aleatórias (</w:t>
-            </w:r>
-            <w:proofErr w:type="spellStart"/>
-            <w:r>
-              <w:t>randf_range</w:t>
-            </w:r>
-            <w:proofErr w:type="spellEnd"/>
-            <w:r>
-              <w:t>).</w:t>
+            <w:r>
+              <w:t xml:space="preserve"> de Spawns</w:t>
+            </w:r>
+          </w:p>
+        </w:tc>
+        <w:tc>
+          <w:tcPr>
+            <w:tcW w:w="2880" w:type="dxa"/>
+          </w:tcPr>
+          <w:p>
+            <w:pPr>
+              <w:rPr>
+                <w:lang w:val="pt-BR"/>
+              </w:rPr>
+            </w:pPr>
+            <w:r>
+              <w:rPr>
+                <w:lang w:val="pt-BR"/>
+              </w:rPr>
+              <w:t>Nó autônomo com Timer gera inimigos e itens em coordenadas aleatórias (randf_range).</w:t>
             </w:r>
           </w:p>
         </w:tc>
@@ -708,21 +787,16 @@
             <w:tcW w:w="2880" w:type="dxa"/>
           </w:tcPr>
           <w:p>
-            <w:proofErr w:type="spellStart"/>
-            <w:r>
-              <w:t>GameManager</w:t>
-            </w:r>
-            <w:proofErr w:type="spellEnd"/>
-            <w:r>
-              <w:t xml:space="preserve"> em </w:t>
-            </w:r>
-            <w:proofErr w:type="spellStart"/>
-            <w:r>
-              <w:t>Autoload</w:t>
-            </w:r>
-            <w:proofErr w:type="spellEnd"/>
-            <w:r>
-              <w:t>; armazena estado global, score de tempo e centraliza sinais.</w:t>
+            <w:pPr>
+              <w:rPr>
+                <w:lang w:val="pt-BR"/>
+              </w:rPr>
+            </w:pPr>
+            <w:r>
+              <w:rPr>
+                <w:lang w:val="pt-BR"/>
+              </w:rPr>
+              <w:t>GameManager em Autoload; armazena estado global, score de tempo e centraliza sinais.</w:t>
             </w:r>
           </w:p>
         </w:tc>
@@ -734,49 +808,42 @@
           </w:tcPr>
           <w:p>
             <w:r>
+              <w:t>#09</w:t>
+            </w:r>
+          </w:p>
+        </w:tc>
+        <w:tc>
+          <w:tcPr>
+            <w:tcW w:w="2880" w:type="dxa"/>
+          </w:tcPr>
+          <w:p>
+            <w:r>
+              <w:t>Interface (HUD)</w:t>
+            </w:r>
+          </w:p>
+        </w:tc>
+        <w:tc>
+          <w:tcPr>
+            <w:tcW w:w="2880" w:type="dxa"/>
+          </w:tcPr>
+          <w:p>
+            <w:pPr>
+              <w:rPr>
+                <w:lang w:val="pt-BR"/>
+              </w:rPr>
+            </w:pPr>
+            <w:r>
+              <w:rPr>
+                <w:lang w:val="pt-BR"/>
+              </w:rPr>
+              <w:t>CanvasLayer com Progress</w:t>
+            </w:r>
+            <w:r>
+              <w:rPr>
+                <w:lang w:val="pt-BR"/>
+              </w:rPr>
               <w:lastRenderedPageBreak/>
-              <w:t>#09</w:t>
-            </w:r>
-          </w:p>
-        </w:tc>
-        <w:tc>
-          <w:tcPr>
-            <w:tcW w:w="2880" w:type="dxa"/>
-          </w:tcPr>
-          <w:p>
-            <w:r>
-              <w:t>Interface (HUD)</w:t>
-            </w:r>
-          </w:p>
-        </w:tc>
-        <w:tc>
-          <w:tcPr>
-            <w:tcW w:w="2880" w:type="dxa"/>
-          </w:tcPr>
-          <w:p>
-            <w:proofErr w:type="spellStart"/>
-            <w:r>
-              <w:t>CanvasLayer</w:t>
-            </w:r>
-            <w:proofErr w:type="spellEnd"/>
-            <w:r>
-              <w:t xml:space="preserve"> com </w:t>
-            </w:r>
-            <w:proofErr w:type="spellStart"/>
-            <w:r>
-              <w:t>ProgressBar</w:t>
-            </w:r>
-            <w:proofErr w:type="spellEnd"/>
-            <w:r>
-              <w:t xml:space="preserve"> para vida e </w:t>
-            </w:r>
-            <w:proofErr w:type="spellStart"/>
-            <w:r>
-              <w:t>Label</w:t>
-            </w:r>
-            <w:proofErr w:type="spellEnd"/>
-            <w:r>
-              <w:t xml:space="preserve"> dinâmico exibindo tempo de sobrevivência.</w:t>
+              <w:t>Bar para vida e Label dinâmico exibindo tempo de sobrevivência.</w:t>
             </w:r>
           </w:p>
         </w:tc>
@@ -788,6 +855,7 @@
           </w:tcPr>
           <w:p>
             <w:r>
+              <w:lastRenderedPageBreak/>
               <w:t>#10</w:t>
             </w:r>
           </w:p>
@@ -807,7 +875,15 @@
             <w:tcW w:w="2880" w:type="dxa"/>
           </w:tcPr>
           <w:p>
-            <w:r>
+            <w:pPr>
+              <w:rPr>
+                <w:lang w:val="pt-BR"/>
+              </w:rPr>
+            </w:pPr>
+            <w:r>
+              <w:rPr>
+                <w:lang w:val="pt-BR"/>
+              </w:rPr>
               <w:t>Script do Player isolado em estados lógicos com match/case (IDLE, MOVE, DEAD).</w:t>
             </w:r>
           </w:p>
@@ -839,32 +915,16 @@
             <w:tcW w:w="2880" w:type="dxa"/>
           </w:tcPr>
           <w:p>
-            <w:r>
-              <w:t xml:space="preserve">Efeito de </w:t>
-            </w:r>
-            <w:proofErr w:type="spellStart"/>
-            <w:r>
-              <w:t>freeze</w:t>
-            </w:r>
-            <w:proofErr w:type="spellEnd"/>
-            <w:r>
-              <w:t xml:space="preserve"> frame (</w:t>
-            </w:r>
-            <w:proofErr w:type="spellStart"/>
-            <w:r>
-              <w:t>Engine.time_scale</w:t>
-            </w:r>
-            <w:proofErr w:type="spellEnd"/>
-            <w:r>
-              <w:t>) e tremor de câmera (</w:t>
-            </w:r>
-            <w:proofErr w:type="spellStart"/>
-            <w:r>
-              <w:t>Camera</w:t>
-            </w:r>
-            <w:proofErr w:type="spellEnd"/>
-            <w:r>
-              <w:t xml:space="preserve"> Shake) no dano.</w:t>
+            <w:pPr>
+              <w:rPr>
+                <w:lang w:val="pt-BR"/>
+              </w:rPr>
+            </w:pPr>
+            <w:r>
+              <w:rPr>
+                <w:lang w:val="pt-BR"/>
+              </w:rPr>
+              <w:t>Efeito de freeze frame (Engine.time_scale) e tremor de câmera (Camera Shake) no dano.</w:t>
             </w:r>
           </w:p>
         </w:tc>
@@ -895,28 +955,51 @@
             <w:tcW w:w="2880" w:type="dxa"/>
           </w:tcPr>
           <w:p>
-            <w:r>
+            <w:pPr>
+              <w:rPr>
+                <w:lang w:val="pt-BR"/>
+              </w:rPr>
+            </w:pPr>
+            <w:r>
+              <w:rPr>
+                <w:lang w:val="pt-BR"/>
+              </w:rPr>
               <w:t xml:space="preserve">Cenas independentes de Menu Principal e Pause; controle de estado via </w:t>
             </w:r>
             <w:proofErr w:type="spellStart"/>
             <w:r>
+              <w:rPr>
+                <w:lang w:val="pt-BR"/>
+              </w:rPr>
               <w:t>get_</w:t>
             </w:r>
             <w:proofErr w:type="gramStart"/>
             <w:r>
+              <w:rPr>
+                <w:lang w:val="pt-BR"/>
+              </w:rPr>
               <w:t>tree</w:t>
             </w:r>
             <w:proofErr w:type="spellEnd"/>
             <w:r>
+              <w:rPr>
+                <w:lang w:val="pt-BR"/>
+              </w:rPr>
               <w:t>().</w:t>
             </w:r>
             <w:proofErr w:type="spellStart"/>
             <w:r>
+              <w:rPr>
+                <w:lang w:val="pt-BR"/>
+              </w:rPr>
               <w:t>paused</w:t>
             </w:r>
             <w:proofErr w:type="spellEnd"/>
             <w:proofErr w:type="gramEnd"/>
             <w:r>
+              <w:rPr>
+                <w:lang w:val="pt-BR"/>
+              </w:rPr>
               <w:t>.</w:t>
             </w:r>
           </w:p>
@@ -948,13 +1031,16 @@
             <w:tcW w:w="2880" w:type="dxa"/>
           </w:tcPr>
           <w:p>
-            <w:proofErr w:type="spellStart"/>
-            <w:r>
-              <w:t>AudioStreamPlayer</w:t>
-            </w:r>
-            <w:proofErr w:type="spellEnd"/>
-            <w:r>
-              <w:t xml:space="preserve"> para música (BGM) e AudioStreamPlayer2D para sons posicionais de inimigos (SFX).</w:t>
+            <w:pPr>
+              <w:rPr>
+                <w:lang w:val="pt-BR"/>
+              </w:rPr>
+            </w:pPr>
+            <w:r>
+              <w:rPr>
+                <w:lang w:val="pt-BR"/>
+              </w:rPr>
+              <w:t>AudioStreamPlayer para música (BGM) e AudioStreamPlayer2D para sons posicionais de inimigos (SFX).</w:t>
             </w:r>
           </w:p>
         </w:tc>
@@ -985,24 +1071,16 @@
             <w:tcW w:w="2880" w:type="dxa"/>
           </w:tcPr>
           <w:p>
-            <w:r>
-              <w:t xml:space="preserve">Gravação e leitura do High Score local utilizando a classe </w:t>
-            </w:r>
-            <w:proofErr w:type="spellStart"/>
-            <w:r>
-              <w:t>FileAccess</w:t>
-            </w:r>
-            <w:proofErr w:type="spellEnd"/>
-            <w:r>
-              <w:t xml:space="preserve"> do Godot (arquivo .</w:t>
-            </w:r>
-            <w:proofErr w:type="spellStart"/>
-            <w:r>
-              <w:t>cfg</w:t>
-            </w:r>
-            <w:proofErr w:type="spellEnd"/>
-            <w:r>
-              <w:t>).</w:t>
+            <w:pPr>
+              <w:rPr>
+                <w:lang w:val="pt-BR"/>
+              </w:rPr>
+            </w:pPr>
+            <w:r>
+              <w:rPr>
+                <w:lang w:val="pt-BR"/>
+              </w:rPr>
+              <w:t>Gravação e leitura do High Score local utilizando a classe FileAccess do Godot (arquivo .cfg).</w:t>
             </w:r>
           </w:p>
         </w:tc>
@@ -1033,7 +1111,15 @@
             <w:tcW w:w="2880" w:type="dxa"/>
           </w:tcPr>
           <w:p>
-            <w:r>
+            <w:pPr>
+              <w:rPr>
+                <w:lang w:val="pt-BR"/>
+              </w:rPr>
+            </w:pPr>
+            <w:r>
+              <w:rPr>
+                <w:lang w:val="pt-BR"/>
+              </w:rPr>
               <w:t>GPUParticles2D configurado para emitir rastro do jogador e explosão de partículas na coleta.</w:t>
             </w:r>
           </w:p>
@@ -1055,28 +1141,31 @@
             <w:tcW w:w="2880" w:type="dxa"/>
           </w:tcPr>
           <w:p>
-            <w:r>
-              <w:t xml:space="preserve">Integração </w:t>
-            </w:r>
             <w:proofErr w:type="spellStart"/>
             <w:r>
-              <w:t>Gamepad</w:t>
+              <w:t>Integração</w:t>
             </w:r>
             <w:proofErr w:type="spellEnd"/>
-          </w:p>
-        </w:tc>
-        <w:tc>
-          <w:tcPr>
-            <w:tcW w:w="2880" w:type="dxa"/>
-          </w:tcPr>
-          <w:p>
+            <w:r>
+              <w:t xml:space="preserve"> Gamepad</w:t>
+            </w:r>
+          </w:p>
+        </w:tc>
+        <w:tc>
+          <w:tcPr>
+            <w:tcW w:w="2880" w:type="dxa"/>
+          </w:tcPr>
+          <w:p>
+            <w:r>
+              <w:t xml:space="preserve">Joypad </w:t>
+            </w:r>
             <w:proofErr w:type="spellStart"/>
             <w:r>
-              <w:t>Joypad</w:t>
+              <w:t>mapeado</w:t>
             </w:r>
             <w:proofErr w:type="spellEnd"/>
             <w:r>
-              <w:t xml:space="preserve"> mapeado no </w:t>
+              <w:t xml:space="preserve"> no </w:t>
             </w:r>
             <w:proofErr w:type="spellStart"/>
             <w:r>
@@ -1084,15 +1173,31 @@
             </w:r>
             <w:proofErr w:type="spellEnd"/>
             <w:r>
-              <w:t xml:space="preserve">, aplicação de </w:t>
+              <w:t xml:space="preserve">, </w:t>
             </w:r>
             <w:proofErr w:type="spellStart"/>
             <w:r>
+              <w:t>aplicação</w:t>
+            </w:r>
+            <w:proofErr w:type="spellEnd"/>
+            <w:r>
+              <w:t xml:space="preserve"> de </w:t>
+            </w:r>
+            <w:proofErr w:type="spellStart"/>
+            <w:r>
               <w:t>deadzones</w:t>
             </w:r>
             <w:proofErr w:type="spellEnd"/>
             <w:r>
-              <w:t xml:space="preserve"> e feedback tátil (</w:t>
+              <w:t xml:space="preserve"> e feedback </w:t>
+            </w:r>
+            <w:proofErr w:type="spellStart"/>
+            <w:r>
+              <w:t>tátil</w:t>
+            </w:r>
+            <w:proofErr w:type="spellEnd"/>
+            <w:r>
+              <w:t xml:space="preserve"> (</w:t>
             </w:r>
             <w:proofErr w:type="spellStart"/>
             <w:r>
@@ -1131,32 +1236,16 @@
             <w:tcW w:w="2880" w:type="dxa"/>
           </w:tcPr>
           <w:p>
-            <w:r>
-              <w:t xml:space="preserve">Configuração de </w:t>
-            </w:r>
-            <w:proofErr w:type="spellStart"/>
-            <w:r>
-              <w:t>Export</w:t>
-            </w:r>
-            <w:proofErr w:type="spellEnd"/>
-            <w:r>
-              <w:t xml:space="preserve"> </w:t>
-            </w:r>
-            <w:proofErr w:type="spellStart"/>
-            <w:r>
-              <w:t>Presets</w:t>
-            </w:r>
-            <w:proofErr w:type="spellEnd"/>
-            <w:r>
-              <w:t>; geração dos binários compilados (.</w:t>
-            </w:r>
-            <w:proofErr w:type="spellStart"/>
-            <w:r>
-              <w:t>exe</w:t>
-            </w:r>
-            <w:proofErr w:type="spellEnd"/>
-            <w:r>
-              <w:t xml:space="preserve"> / Linux) e ajustes de ícone.</w:t>
+            <w:pPr>
+              <w:rPr>
+                <w:lang w:val="pt-BR"/>
+              </w:rPr>
+            </w:pPr>
+            <w:r>
+              <w:rPr>
+                <w:lang w:val="pt-BR"/>
+              </w:rPr>
+              <w:t>Configuração de Export Presets; geração dos binários compilados (.exe / Linux) e ajustes de ícone.</w:t>
             </w:r>
           </w:p>
         </w:tc>
@@ -2936,7 +3025,6 @@
   <w:style w:type="character" w:default="1" w:styleId="Fontepargpadro">
     <w:name w:val="Default Paragraph Font"/>
     <w:uiPriority w:val="1"/>
-    <w:semiHidden/>
     <w:unhideWhenUsed/>
   </w:style>
   <w:style w:type="table" w:default="1" w:styleId="Tabelanormal">

</xml_diff>

<commit_message>
Foi adicionado novos IDs ao backlog
</commit_message>
<xml_diff>
--- a/Proposta/GDD_Backlog_SurviveGD.docx
+++ b/Proposta/GDD_Backlog_SurviveGD.docx
@@ -348,14 +348,17 @@
         <w:tblLook w:val="04A0" w:firstRow="1" w:lastRow="0" w:firstColumn="1" w:lastColumn="0" w:noHBand="0" w:noVBand="1"/>
       </w:tblPr>
       <w:tblGrid>
-        <w:gridCol w:w="2880"/>
-        <w:gridCol w:w="2880"/>
-        <w:gridCol w:w="2880"/>
+        <w:gridCol w:w="2884"/>
+        <w:gridCol w:w="2884"/>
+        <w:gridCol w:w="2884"/>
       </w:tblGrid>
       <w:tr>
-        <w:tc>
-          <w:tcPr>
-            <w:tcW w:w="2880" w:type="dxa"/>
+        <w:trPr>
+          <w:trHeight w:val="315"/>
+        </w:trPr>
+        <w:tc>
+          <w:tcPr>
+            <w:tcW w:w="2884" w:type="dxa"/>
           </w:tcPr>
           <w:p>
             <w:r>
@@ -365,7 +368,7 @@
         </w:tc>
         <w:tc>
           <w:tcPr>
-            <w:tcW w:w="2880" w:type="dxa"/>
+            <w:tcW w:w="2884" w:type="dxa"/>
           </w:tcPr>
           <w:p>
             <w:r>
@@ -375,7 +378,7 @@
         </w:tc>
         <w:tc>
           <w:tcPr>
-            <w:tcW w:w="2880" w:type="dxa"/>
+            <w:tcW w:w="2884" w:type="dxa"/>
           </w:tcPr>
           <w:p>
             <w:r>
@@ -385,9 +388,12 @@
         </w:tc>
       </w:tr>
       <w:tr>
-        <w:tc>
-          <w:tcPr>
-            <w:tcW w:w="2880" w:type="dxa"/>
+        <w:trPr>
+          <w:trHeight w:val="960"/>
+        </w:trPr>
+        <w:tc>
+          <w:tcPr>
+            <w:tcW w:w="2884" w:type="dxa"/>
           </w:tcPr>
           <w:p>
             <w:r>
@@ -397,7 +403,7 @@
         </w:tc>
         <w:tc>
           <w:tcPr>
-            <w:tcW w:w="2880" w:type="dxa"/>
+            <w:tcW w:w="2884" w:type="dxa"/>
           </w:tcPr>
           <w:p>
             <w:r>
@@ -407,7 +413,7 @@
         </w:tc>
         <w:tc>
           <w:tcPr>
-            <w:tcW w:w="2880" w:type="dxa"/>
+            <w:tcW w:w="2884" w:type="dxa"/>
           </w:tcPr>
           <w:p>
             <w:pPr>
@@ -475,9 +481,12 @@
         </w:tc>
       </w:tr>
       <w:tr>
-        <w:tc>
-          <w:tcPr>
-            <w:tcW w:w="2880" w:type="dxa"/>
+        <w:trPr>
+          <w:trHeight w:val="960"/>
+        </w:trPr>
+        <w:tc>
+          <w:tcPr>
+            <w:tcW w:w="2884" w:type="dxa"/>
           </w:tcPr>
           <w:p>
             <w:r>
@@ -487,7 +496,7 @@
         </w:tc>
         <w:tc>
           <w:tcPr>
-            <w:tcW w:w="2880" w:type="dxa"/>
+            <w:tcW w:w="2884" w:type="dxa"/>
           </w:tcPr>
           <w:p>
             <w:r>
@@ -497,7 +506,7 @@
         </w:tc>
         <w:tc>
           <w:tcPr>
-            <w:tcW w:w="2880" w:type="dxa"/>
+            <w:tcW w:w="2884" w:type="dxa"/>
           </w:tcPr>
           <w:p>
             <w:pPr>
@@ -515,9 +524,12 @@
         </w:tc>
       </w:tr>
       <w:tr>
-        <w:tc>
-          <w:tcPr>
-            <w:tcW w:w="2880" w:type="dxa"/>
+        <w:trPr>
+          <w:trHeight w:val="975"/>
+        </w:trPr>
+        <w:tc>
+          <w:tcPr>
+            <w:tcW w:w="2884" w:type="dxa"/>
           </w:tcPr>
           <w:p>
             <w:r>
@@ -527,7 +539,7 @@
         </w:tc>
         <w:tc>
           <w:tcPr>
-            <w:tcW w:w="2880" w:type="dxa"/>
+            <w:tcW w:w="2884" w:type="dxa"/>
           </w:tcPr>
           <w:p>
             <w:r>
@@ -537,7 +549,7 @@
         </w:tc>
         <w:tc>
           <w:tcPr>
-            <w:tcW w:w="2880" w:type="dxa"/>
+            <w:tcW w:w="2884" w:type="dxa"/>
           </w:tcPr>
           <w:p>
             <w:pPr>
@@ -555,9 +567,12 @@
         </w:tc>
       </w:tr>
       <w:tr>
-        <w:tc>
-          <w:tcPr>
-            <w:tcW w:w="2880" w:type="dxa"/>
+        <w:trPr>
+          <w:trHeight w:val="960"/>
+        </w:trPr>
+        <w:tc>
+          <w:tcPr>
+            <w:tcW w:w="2884" w:type="dxa"/>
           </w:tcPr>
           <w:p>
             <w:r>
@@ -567,7 +582,7 @@
         </w:tc>
         <w:tc>
           <w:tcPr>
-            <w:tcW w:w="2880" w:type="dxa"/>
+            <w:tcW w:w="2884" w:type="dxa"/>
           </w:tcPr>
           <w:p>
             <w:r>
@@ -577,7 +592,7 @@
         </w:tc>
         <w:tc>
           <w:tcPr>
-            <w:tcW w:w="2880" w:type="dxa"/>
+            <w:tcW w:w="2884" w:type="dxa"/>
           </w:tcPr>
           <w:p>
             <w:pPr>
@@ -595,9 +610,12 @@
         </w:tc>
       </w:tr>
       <w:tr>
-        <w:tc>
-          <w:tcPr>
-            <w:tcW w:w="2880" w:type="dxa"/>
+        <w:trPr>
+          <w:trHeight w:val="960"/>
+        </w:trPr>
+        <w:tc>
+          <w:tcPr>
+            <w:tcW w:w="2884" w:type="dxa"/>
           </w:tcPr>
           <w:p>
             <w:r>
@@ -607,7 +625,7 @@
         </w:tc>
         <w:tc>
           <w:tcPr>
-            <w:tcW w:w="2880" w:type="dxa"/>
+            <w:tcW w:w="2884" w:type="dxa"/>
           </w:tcPr>
           <w:p>
             <w:r>
@@ -617,7 +635,7 @@
         </w:tc>
         <w:tc>
           <w:tcPr>
-            <w:tcW w:w="2880" w:type="dxa"/>
+            <w:tcW w:w="2884" w:type="dxa"/>
           </w:tcPr>
           <w:p>
             <w:pPr>
@@ -663,9 +681,12 @@
         </w:tc>
       </w:tr>
       <w:tr>
-        <w:tc>
-          <w:tcPr>
-            <w:tcW w:w="2880" w:type="dxa"/>
+        <w:trPr>
+          <w:trHeight w:val="1605"/>
+        </w:trPr>
+        <w:tc>
+          <w:tcPr>
+            <w:tcW w:w="2884" w:type="dxa"/>
           </w:tcPr>
           <w:p>
             <w:r>
@@ -675,7 +696,7 @@
         </w:tc>
         <w:tc>
           <w:tcPr>
-            <w:tcW w:w="2880" w:type="dxa"/>
+            <w:tcW w:w="2884" w:type="dxa"/>
           </w:tcPr>
           <w:p>
             <w:r>
@@ -685,7 +706,7 @@
         </w:tc>
         <w:tc>
           <w:tcPr>
-            <w:tcW w:w="2880" w:type="dxa"/>
+            <w:tcW w:w="2884" w:type="dxa"/>
           </w:tcPr>
           <w:p>
             <w:pPr>
@@ -717,9 +738,12 @@
         </w:tc>
       </w:tr>
       <w:tr>
-        <w:tc>
-          <w:tcPr>
-            <w:tcW w:w="2880" w:type="dxa"/>
+        <w:trPr>
+          <w:trHeight w:val="1290"/>
+        </w:trPr>
+        <w:tc>
+          <w:tcPr>
+            <w:tcW w:w="2884" w:type="dxa"/>
           </w:tcPr>
           <w:p>
             <w:r>
@@ -729,7 +753,7 @@
         </w:tc>
         <w:tc>
           <w:tcPr>
-            <w:tcW w:w="2880" w:type="dxa"/>
+            <w:tcW w:w="2884" w:type="dxa"/>
           </w:tcPr>
           <w:p>
             <w:proofErr w:type="spellStart"/>
@@ -744,7 +768,7 @@
         </w:tc>
         <w:tc>
           <w:tcPr>
-            <w:tcW w:w="2880" w:type="dxa"/>
+            <w:tcW w:w="2884" w:type="dxa"/>
           </w:tcPr>
           <w:p>
             <w:pPr>
@@ -762,9 +786,12 @@
         </w:tc>
       </w:tr>
       <w:tr>
-        <w:tc>
-          <w:tcPr>
-            <w:tcW w:w="2880" w:type="dxa"/>
+        <w:trPr>
+          <w:trHeight w:val="1275"/>
+        </w:trPr>
+        <w:tc>
+          <w:tcPr>
+            <w:tcW w:w="2884" w:type="dxa"/>
           </w:tcPr>
           <w:p>
             <w:r>
@@ -774,7 +801,7 @@
         </w:tc>
         <w:tc>
           <w:tcPr>
-            <w:tcW w:w="2880" w:type="dxa"/>
+            <w:tcW w:w="2884" w:type="dxa"/>
           </w:tcPr>
           <w:p>
             <w:r>
@@ -784,7 +811,7 @@
         </w:tc>
         <w:tc>
           <w:tcPr>
-            <w:tcW w:w="2880" w:type="dxa"/>
+            <w:tcW w:w="2884" w:type="dxa"/>
           </w:tcPr>
           <w:p>
             <w:pPr>
@@ -802,9 +829,12 @@
         </w:tc>
       </w:tr>
       <w:tr>
-        <w:tc>
-          <w:tcPr>
-            <w:tcW w:w="2880" w:type="dxa"/>
+        <w:trPr>
+          <w:trHeight w:val="315"/>
+        </w:trPr>
+        <w:tc>
+          <w:tcPr>
+            <w:tcW w:w="2884" w:type="dxa"/>
           </w:tcPr>
           <w:p>
             <w:r>
@@ -814,7 +844,7 @@
         </w:tc>
         <w:tc>
           <w:tcPr>
-            <w:tcW w:w="2880" w:type="dxa"/>
+            <w:tcW w:w="2884" w:type="dxa"/>
           </w:tcPr>
           <w:p>
             <w:r>
@@ -824,7 +854,7 @@
         </w:tc>
         <w:tc>
           <w:tcPr>
-            <w:tcW w:w="2880" w:type="dxa"/>
+            <w:tcW w:w="2884" w:type="dxa"/>
           </w:tcPr>
           <w:p>
             <w:pPr>
@@ -849,9 +879,12 @@
         </w:tc>
       </w:tr>
       <w:tr>
-        <w:tc>
-          <w:tcPr>
-            <w:tcW w:w="2880" w:type="dxa"/>
+        <w:trPr>
+          <w:trHeight w:val="144"/>
+        </w:trPr>
+        <w:tc>
+          <w:tcPr>
+            <w:tcW w:w="2884" w:type="dxa"/>
           </w:tcPr>
           <w:p>
             <w:r>
@@ -862,7 +895,7 @@
         </w:tc>
         <w:tc>
           <w:tcPr>
-            <w:tcW w:w="2880" w:type="dxa"/>
+            <w:tcW w:w="2884" w:type="dxa"/>
           </w:tcPr>
           <w:p>
             <w:r>
@@ -872,7 +905,7 @@
         </w:tc>
         <w:tc>
           <w:tcPr>
-            <w:tcW w:w="2880" w:type="dxa"/>
+            <w:tcW w:w="2884" w:type="dxa"/>
           </w:tcPr>
           <w:p>
             <w:pPr>
@@ -890,9 +923,12 @@
         </w:tc>
       </w:tr>
       <w:tr>
-        <w:tc>
-          <w:tcPr>
-            <w:tcW w:w="2880" w:type="dxa"/>
+        <w:trPr>
+          <w:trHeight w:val="144"/>
+        </w:trPr>
+        <w:tc>
+          <w:tcPr>
+            <w:tcW w:w="2884" w:type="dxa"/>
           </w:tcPr>
           <w:p>
             <w:r>
@@ -902,7 +938,7 @@
         </w:tc>
         <w:tc>
           <w:tcPr>
-            <w:tcW w:w="2880" w:type="dxa"/>
+            <w:tcW w:w="2884" w:type="dxa"/>
           </w:tcPr>
           <w:p>
             <w:r>
@@ -912,7 +948,7 @@
         </w:tc>
         <w:tc>
           <w:tcPr>
-            <w:tcW w:w="2880" w:type="dxa"/>
+            <w:tcW w:w="2884" w:type="dxa"/>
           </w:tcPr>
           <w:p>
             <w:pPr>
@@ -930,9 +966,12 @@
         </w:tc>
       </w:tr>
       <w:tr>
-        <w:tc>
-          <w:tcPr>
-            <w:tcW w:w="2880" w:type="dxa"/>
+        <w:trPr>
+          <w:trHeight w:val="144"/>
+        </w:trPr>
+        <w:tc>
+          <w:tcPr>
+            <w:tcW w:w="2884" w:type="dxa"/>
           </w:tcPr>
           <w:p>
             <w:r>
@@ -942,7 +981,7 @@
         </w:tc>
         <w:tc>
           <w:tcPr>
-            <w:tcW w:w="2880" w:type="dxa"/>
+            <w:tcW w:w="2884" w:type="dxa"/>
           </w:tcPr>
           <w:p>
             <w:r>
@@ -952,7 +991,7 @@
         </w:tc>
         <w:tc>
           <w:tcPr>
-            <w:tcW w:w="2880" w:type="dxa"/>
+            <w:tcW w:w="2884" w:type="dxa"/>
           </w:tcPr>
           <w:p>
             <w:pPr>
@@ -1006,9 +1045,12 @@
         </w:tc>
       </w:tr>
       <w:tr>
-        <w:tc>
-          <w:tcPr>
-            <w:tcW w:w="2880" w:type="dxa"/>
+        <w:trPr>
+          <w:trHeight w:val="144"/>
+        </w:trPr>
+        <w:tc>
+          <w:tcPr>
+            <w:tcW w:w="2884" w:type="dxa"/>
           </w:tcPr>
           <w:p>
             <w:r>
@@ -1018,7 +1060,7 @@
         </w:tc>
         <w:tc>
           <w:tcPr>
-            <w:tcW w:w="2880" w:type="dxa"/>
+            <w:tcW w:w="2884" w:type="dxa"/>
           </w:tcPr>
           <w:p>
             <w:r>
@@ -1028,7 +1070,7 @@
         </w:tc>
         <w:tc>
           <w:tcPr>
-            <w:tcW w:w="2880" w:type="dxa"/>
+            <w:tcW w:w="2884" w:type="dxa"/>
           </w:tcPr>
           <w:p>
             <w:pPr>
@@ -1046,9 +1088,12 @@
         </w:tc>
       </w:tr>
       <w:tr>
-        <w:tc>
-          <w:tcPr>
-            <w:tcW w:w="2880" w:type="dxa"/>
+        <w:trPr>
+          <w:trHeight w:val="144"/>
+        </w:trPr>
+        <w:tc>
+          <w:tcPr>
+            <w:tcW w:w="2884" w:type="dxa"/>
           </w:tcPr>
           <w:p>
             <w:r>
@@ -1058,7 +1103,7 @@
         </w:tc>
         <w:tc>
           <w:tcPr>
-            <w:tcW w:w="2880" w:type="dxa"/>
+            <w:tcW w:w="2884" w:type="dxa"/>
           </w:tcPr>
           <w:p>
             <w:r>
@@ -1068,7 +1113,7 @@
         </w:tc>
         <w:tc>
           <w:tcPr>
-            <w:tcW w:w="2880" w:type="dxa"/>
+            <w:tcW w:w="2884" w:type="dxa"/>
           </w:tcPr>
           <w:p>
             <w:pPr>
@@ -1086,9 +1131,12 @@
         </w:tc>
       </w:tr>
       <w:tr>
-        <w:tc>
-          <w:tcPr>
-            <w:tcW w:w="2880" w:type="dxa"/>
+        <w:trPr>
+          <w:trHeight w:val="144"/>
+        </w:trPr>
+        <w:tc>
+          <w:tcPr>
+            <w:tcW w:w="2884" w:type="dxa"/>
           </w:tcPr>
           <w:p>
             <w:r>
@@ -1098,7 +1146,7 @@
         </w:tc>
         <w:tc>
           <w:tcPr>
-            <w:tcW w:w="2880" w:type="dxa"/>
+            <w:tcW w:w="2884" w:type="dxa"/>
           </w:tcPr>
           <w:p>
             <w:r>
@@ -1108,7 +1156,7 @@
         </w:tc>
         <w:tc>
           <w:tcPr>
-            <w:tcW w:w="2880" w:type="dxa"/>
+            <w:tcW w:w="2884" w:type="dxa"/>
           </w:tcPr>
           <w:p>
             <w:pPr>
@@ -1126,9 +1174,12 @@
         </w:tc>
       </w:tr>
       <w:tr>
-        <w:tc>
-          <w:tcPr>
-            <w:tcW w:w="2880" w:type="dxa"/>
+        <w:trPr>
+          <w:trHeight w:val="144"/>
+        </w:trPr>
+        <w:tc>
+          <w:tcPr>
+            <w:tcW w:w="2884" w:type="dxa"/>
           </w:tcPr>
           <w:p>
             <w:r>
@@ -1138,7 +1189,7 @@
         </w:tc>
         <w:tc>
           <w:tcPr>
-            <w:tcW w:w="2880" w:type="dxa"/>
+            <w:tcW w:w="2884" w:type="dxa"/>
           </w:tcPr>
           <w:p>
             <w:proofErr w:type="spellStart"/>
@@ -1153,7 +1204,7 @@
         </w:tc>
         <w:tc>
           <w:tcPr>
-            <w:tcW w:w="2880" w:type="dxa"/>
+            <w:tcW w:w="2884" w:type="dxa"/>
           </w:tcPr>
           <w:p>
             <w:r>
@@ -1211,9 +1262,12 @@
         </w:tc>
       </w:tr>
       <w:tr>
-        <w:tc>
-          <w:tcPr>
-            <w:tcW w:w="2880" w:type="dxa"/>
+        <w:trPr>
+          <w:trHeight w:val="1275"/>
+        </w:trPr>
+        <w:tc>
+          <w:tcPr>
+            <w:tcW w:w="2884" w:type="dxa"/>
           </w:tcPr>
           <w:p>
             <w:r>
@@ -1223,7 +1277,7 @@
         </w:tc>
         <w:tc>
           <w:tcPr>
-            <w:tcW w:w="2880" w:type="dxa"/>
+            <w:tcW w:w="2884" w:type="dxa"/>
           </w:tcPr>
           <w:p>
             <w:r>
@@ -1233,7 +1287,7 @@
         </w:tc>
         <w:tc>
           <w:tcPr>
-            <w:tcW w:w="2880" w:type="dxa"/>
+            <w:tcW w:w="2884" w:type="dxa"/>
           </w:tcPr>
           <w:p>
             <w:pPr>
@@ -1247,6 +1301,1164 @@
               </w:rPr>
               <w:t>Configuração de Export Presets; geração dos binários compilados (.exe / Linux) e ajustes de ícone.</w:t>
             </w:r>
+          </w:p>
+        </w:tc>
+      </w:tr>
+      <w:tr>
+        <w:trPr>
+          <w:trHeight w:val="1275"/>
+        </w:trPr>
+        <w:tc>
+          <w:tcPr>
+            <w:tcW w:w="2884" w:type="dxa"/>
+          </w:tcPr>
+          <w:p>
+            <w:r>
+              <w:rPr>
+                <w:lang w:val="pt-BR"/>
+              </w:rPr>
+              <w:t>#18</w:t>
+            </w:r>
+          </w:p>
+        </w:tc>
+        <w:tc>
+          <w:tcPr>
+            <w:tcW w:w="2884" w:type="dxa"/>
+          </w:tcPr>
+          <w:p>
+            <w:pPr>
+              <w:rPr>
+                <w:lang w:val="pt-BR"/>
+              </w:rPr>
+            </w:pPr>
+            <w:r>
+              <w:rPr>
+                <w:lang w:val="pt-BR"/>
+              </w:rPr>
+              <w:t>Sistema de Dano por Contato</w:t>
+            </w:r>
+          </w:p>
+        </w:tc>
+        <w:tc>
+          <w:tcPr>
+            <w:tcW w:w="2884" w:type="dxa"/>
+          </w:tcPr>
+          <w:p>
+            <w:pPr>
+              <w:rPr>
+                <w:lang w:val="pt-BR"/>
+              </w:rPr>
+            </w:pPr>
+            <w:r>
+              <w:rPr>
+                <w:lang w:val="pt-BR"/>
+              </w:rPr>
+              <w:t xml:space="preserve">Utilização de colisão física ou Area2D nos inimigos para deduzir a variável </w:t>
+            </w:r>
+            <w:proofErr w:type="spellStart"/>
+            <w:r>
+              <w:rPr>
+                <w:lang w:val="pt-BR"/>
+              </w:rPr>
+              <w:t>vida_atual</w:t>
+            </w:r>
+            <w:proofErr w:type="spellEnd"/>
+            <w:r>
+              <w:rPr>
+                <w:lang w:val="pt-BR"/>
+              </w:rPr>
+              <w:t xml:space="preserve"> no </w:t>
+            </w:r>
+            <w:proofErr w:type="spellStart"/>
+            <w:r>
+              <w:rPr>
+                <w:lang w:val="pt-BR"/>
+              </w:rPr>
+              <w:t>GameManager</w:t>
+            </w:r>
+            <w:proofErr w:type="spellEnd"/>
+            <w:r>
+              <w:rPr>
+                <w:lang w:val="pt-BR"/>
+              </w:rPr>
+              <w:t xml:space="preserve"> </w:t>
+            </w:r>
+            <w:r>
+              <w:rPr>
+                <w:lang w:val="pt-BR"/>
+              </w:rPr>
+              <w:lastRenderedPageBreak/>
+              <w:t xml:space="preserve">e emitir </w:t>
+            </w:r>
+            <w:proofErr w:type="spellStart"/>
+            <w:r>
+              <w:rPr>
+                <w:lang w:val="pt-BR"/>
+              </w:rPr>
+              <w:t>vida_alterada</w:t>
+            </w:r>
+            <w:proofErr w:type="spellEnd"/>
+            <w:r>
+              <w:rPr>
+                <w:lang w:val="pt-BR"/>
+              </w:rPr>
+              <w:t>.</w:t>
+            </w:r>
+          </w:p>
+        </w:tc>
+      </w:tr>
+      <w:tr>
+        <w:trPr>
+          <w:trHeight w:val="1275"/>
+        </w:trPr>
+        <w:tc>
+          <w:tcPr>
+            <w:tcW w:w="2884" w:type="dxa"/>
+          </w:tcPr>
+          <w:p>
+            <w:pPr>
+              <w:rPr>
+                <w:lang w:val="pt-BR"/>
+              </w:rPr>
+            </w:pPr>
+            <w:r>
+              <w:rPr>
+                <w:lang w:val="pt-BR"/>
+              </w:rPr>
+              <w:lastRenderedPageBreak/>
+              <w:t>#19</w:t>
+            </w:r>
+          </w:p>
+        </w:tc>
+        <w:tc>
+          <w:tcPr>
+            <w:tcW w:w="2884" w:type="dxa"/>
+          </w:tcPr>
+          <w:p>
+            <w:pPr>
+              <w:rPr>
+                <w:lang w:val="pt-BR"/>
+              </w:rPr>
+            </w:pPr>
+            <w:r>
+              <w:rPr>
+                <w:lang w:val="pt-BR"/>
+              </w:rPr>
+              <w:t>Imunidade Temporária (i-frames)</w:t>
+            </w:r>
+          </w:p>
+        </w:tc>
+        <w:tc>
+          <w:tcPr>
+            <w:tcW w:w="2884" w:type="dxa"/>
+          </w:tcPr>
+          <w:p>
+            <w:pPr>
+              <w:rPr>
+                <w:lang w:val="pt-BR"/>
+              </w:rPr>
+            </w:pPr>
+            <w:r>
+              <w:rPr>
+                <w:lang w:val="pt-BR"/>
+              </w:rPr>
+              <w:t xml:space="preserve">Adição de um nó Timer ativado no recebimento de dano para desativar a máscara de colisão e intercalar a propriedade </w:t>
+            </w:r>
+            <w:proofErr w:type="spellStart"/>
+            <w:r>
+              <w:rPr>
+                <w:lang w:val="pt-BR"/>
+              </w:rPr>
+              <w:t>modulate</w:t>
+            </w:r>
+            <w:proofErr w:type="spellEnd"/>
+            <w:r>
+              <w:rPr>
+                <w:lang w:val="pt-BR"/>
+              </w:rPr>
+              <w:t xml:space="preserve"> alfa do jogador.</w:t>
+            </w:r>
+          </w:p>
+        </w:tc>
+      </w:tr>
+      <w:tr>
+        <w:trPr>
+          <w:trHeight w:val="1275"/>
+        </w:trPr>
+        <w:tc>
+          <w:tcPr>
+            <w:tcW w:w="2884" w:type="dxa"/>
+          </w:tcPr>
+          <w:p>
+            <w:pPr>
+              <w:rPr>
+                <w:lang w:val="pt-BR"/>
+              </w:rPr>
+            </w:pPr>
+            <w:r>
+              <w:rPr>
+                <w:lang w:val="pt-BR"/>
+              </w:rPr>
+              <w:t>#20</w:t>
+            </w:r>
+          </w:p>
+        </w:tc>
+        <w:tc>
+          <w:tcPr>
+            <w:tcW w:w="2884" w:type="dxa"/>
+          </w:tcPr>
+          <w:p>
+            <w:pPr>
+              <w:rPr>
+                <w:lang w:val="pt-BR"/>
+              </w:rPr>
+            </w:pPr>
+            <w:r>
+              <w:rPr>
+                <w:lang w:val="pt-BR"/>
+              </w:rPr>
+              <w:t>Escalonamento Dinâmico (Dificuldade)</w:t>
+            </w:r>
+          </w:p>
+        </w:tc>
+        <w:tc>
+          <w:tcPr>
+            <w:tcW w:w="2884" w:type="dxa"/>
+          </w:tcPr>
+          <w:p>
+            <w:pPr>
+              <w:rPr>
+                <w:lang w:val="pt-BR"/>
+              </w:rPr>
+            </w:pPr>
+            <w:r>
+              <w:rPr>
+                <w:lang w:val="pt-BR"/>
+              </w:rPr>
+              <w:t xml:space="preserve">Lógica que reduz o </w:t>
+            </w:r>
+            <w:proofErr w:type="spellStart"/>
+            <w:r>
+              <w:rPr>
+                <w:lang w:val="pt-BR"/>
+              </w:rPr>
+              <w:t>wait_time</w:t>
+            </w:r>
+            <w:proofErr w:type="spellEnd"/>
+            <w:r>
+              <w:rPr>
+                <w:lang w:val="pt-BR"/>
+              </w:rPr>
+              <w:t xml:space="preserve"> do </w:t>
+            </w:r>
+            <w:proofErr w:type="spellStart"/>
+            <w:r>
+              <w:rPr>
+                <w:lang w:val="pt-BR"/>
+              </w:rPr>
+              <w:t>spawner</w:t>
+            </w:r>
+            <w:proofErr w:type="spellEnd"/>
+            <w:r>
+              <w:rPr>
+                <w:lang w:val="pt-BR"/>
+              </w:rPr>
+              <w:t xml:space="preserve"> e aumenta o vetor multiplicador de velocidade dos inimigos proporcionalmente ao </w:t>
+            </w:r>
+            <w:proofErr w:type="spellStart"/>
+            <w:r>
+              <w:rPr>
+                <w:lang w:val="pt-BR"/>
+              </w:rPr>
+              <w:t>tempo_sobrevivencia</w:t>
+            </w:r>
+            <w:proofErr w:type="spellEnd"/>
+            <w:r>
+              <w:rPr>
+                <w:lang w:val="pt-BR"/>
+              </w:rPr>
+              <w:t>.</w:t>
+            </w:r>
+          </w:p>
+        </w:tc>
+      </w:tr>
+      <w:tr>
+        <w:trPr>
+          <w:trHeight w:val="1275"/>
+        </w:trPr>
+        <w:tc>
+          <w:tcPr>
+            <w:tcW w:w="2884" w:type="dxa"/>
+          </w:tcPr>
+          <w:p>
+            <w:pPr>
+              <w:rPr>
+                <w:lang w:val="pt-BR"/>
+              </w:rPr>
+            </w:pPr>
+            <w:r>
+              <w:rPr>
+                <w:lang w:val="pt-BR"/>
+              </w:rPr>
+              <w:t>#21</w:t>
+            </w:r>
+          </w:p>
+        </w:tc>
+        <w:tc>
+          <w:tcPr>
+            <w:tcW w:w="2884" w:type="dxa"/>
+          </w:tcPr>
+          <w:p>
+            <w:proofErr w:type="spellStart"/>
+            <w:r>
+              <w:t>Animação</w:t>
+            </w:r>
+            <w:proofErr w:type="spellEnd"/>
+            <w:r>
+              <w:t xml:space="preserve"> Baseada em Estados</w:t>
+            </w:r>
+          </w:p>
+          <w:p>
+            <w:pPr>
+              <w:rPr>
+                <w:lang w:val="pt-BR"/>
+              </w:rPr>
+            </w:pPr>
+          </w:p>
+        </w:tc>
+        <w:tc>
+          <w:tcPr>
+            <w:tcW w:w="2884" w:type="dxa"/>
+          </w:tcPr>
+          <w:p>
+            <w:pPr>
+              <w:rPr>
+                <w:lang w:val="pt-BR"/>
+              </w:rPr>
+            </w:pPr>
+            <w:r>
+              <w:rPr>
+                <w:lang w:val="pt-BR"/>
+              </w:rPr>
+              <w:t>I</w:t>
+            </w:r>
+            <w:r>
+              <w:rPr>
+                <w:lang w:val="pt-BR"/>
+              </w:rPr>
+              <w:t xml:space="preserve">ntegração de um </w:t>
+            </w:r>
+            <w:proofErr w:type="spellStart"/>
+            <w:r>
+              <w:rPr>
+                <w:lang w:val="pt-BR"/>
+              </w:rPr>
+              <w:t>AnimationPlayer</w:t>
+            </w:r>
+            <w:proofErr w:type="spellEnd"/>
+            <w:r>
+              <w:rPr>
+                <w:lang w:val="pt-BR"/>
+              </w:rPr>
+              <w:t xml:space="preserve"> mapeado </w:t>
+            </w:r>
+            <w:proofErr w:type="spellStart"/>
+            <w:r>
+              <w:rPr>
+                <w:lang w:val="pt-BR"/>
+              </w:rPr>
+              <w:t>na</w:t>
+            </w:r>
+            <w:proofErr w:type="spellEnd"/>
+            <w:r>
+              <w:rPr>
+                <w:lang w:val="pt-BR"/>
+              </w:rPr>
+              <w:t xml:space="preserve"> FSM (ID #10), transicionando </w:t>
+            </w:r>
+            <w:r>
+              <w:rPr>
+                <w:i/>
+                <w:iCs/>
+                <w:lang w:val="pt-BR"/>
+              </w:rPr>
+              <w:t>sprites</w:t>
+            </w:r>
+            <w:r>
+              <w:rPr>
+                <w:lang w:val="pt-BR"/>
+              </w:rPr>
+              <w:t xml:space="preserve"> de acordo com a normalização do vetor de movimento.</w:t>
+            </w:r>
+          </w:p>
+        </w:tc>
+      </w:tr>
+      <w:tr>
+        <w:trPr>
+          <w:trHeight w:val="1275"/>
+        </w:trPr>
+        <w:tc>
+          <w:tcPr>
+            <w:tcW w:w="2884" w:type="dxa"/>
+          </w:tcPr>
+          <w:p>
+            <w:pPr>
+              <w:rPr>
+                <w:lang w:val="pt-BR"/>
+              </w:rPr>
+            </w:pPr>
+            <w:r>
+              <w:rPr>
+                <w:lang w:val="pt-BR"/>
+              </w:rPr>
+              <w:t>#22</w:t>
+            </w:r>
+          </w:p>
+        </w:tc>
+        <w:tc>
+          <w:tcPr>
+            <w:tcW w:w="2884" w:type="dxa"/>
+          </w:tcPr>
+          <w:p>
+            <w:pPr>
+              <w:rPr>
+                <w:lang w:val="pt-BR"/>
+              </w:rPr>
+            </w:pPr>
+            <w:r>
+              <w:rPr>
+                <w:lang w:val="pt-BR"/>
+              </w:rPr>
+              <w:t>Iluminação de Ambiente</w:t>
+            </w:r>
+          </w:p>
+        </w:tc>
+        <w:tc>
+          <w:tcPr>
+            <w:tcW w:w="2884" w:type="dxa"/>
+          </w:tcPr>
+          <w:p>
+            <w:pPr>
+              <w:rPr>
+                <w:lang w:val="pt-BR"/>
+              </w:rPr>
+            </w:pPr>
+            <w:r>
+              <w:rPr>
+                <w:lang w:val="pt-BR"/>
+              </w:rPr>
+              <w:t xml:space="preserve">Aplicação de </w:t>
+            </w:r>
+            <w:proofErr w:type="spellStart"/>
+            <w:r>
+              <w:rPr>
+                <w:lang w:val="pt-BR"/>
+              </w:rPr>
+              <w:t>CanvasModulate</w:t>
+            </w:r>
+            <w:proofErr w:type="spellEnd"/>
+            <w:r>
+              <w:rPr>
+                <w:lang w:val="pt-BR"/>
+              </w:rPr>
+              <w:t xml:space="preserve"> para escurecimento base e adição de PointLight2D no jogador com oclusão em obstáculos StaticBody2D (ID #03).</w:t>
+            </w:r>
+          </w:p>
+        </w:tc>
+      </w:tr>
+      <w:tr>
+        <w:trPr>
+          <w:trHeight w:val="1275"/>
+        </w:trPr>
+        <w:tc>
+          <w:tcPr>
+            <w:tcW w:w="2884" w:type="dxa"/>
+          </w:tcPr>
+          <w:p>
+            <w:pPr>
+              <w:rPr>
+                <w:lang w:val="pt-BR"/>
+              </w:rPr>
+            </w:pPr>
+            <w:r>
+              <w:rPr>
+                <w:lang w:val="pt-BR"/>
+              </w:rPr>
+              <w:t>#23</w:t>
+            </w:r>
+          </w:p>
+        </w:tc>
+        <w:tc>
+          <w:tcPr>
+            <w:tcW w:w="2884" w:type="dxa"/>
+          </w:tcPr>
+          <w:p>
+            <w:pPr>
+              <w:rPr>
+                <w:lang w:val="pt-BR"/>
+              </w:rPr>
+            </w:pPr>
+            <w:r>
+              <w:rPr>
+                <w:lang w:val="pt-BR"/>
+              </w:rPr>
+              <w:t>Modificadores Temporários (Buffs)</w:t>
+            </w:r>
+          </w:p>
+        </w:tc>
+        <w:tc>
+          <w:tcPr>
+            <w:tcW w:w="2884" w:type="dxa"/>
+          </w:tcPr>
+          <w:p>
+            <w:pPr>
+              <w:rPr>
+                <w:lang w:val="pt-BR"/>
+              </w:rPr>
+            </w:pPr>
+            <w:proofErr w:type="spellStart"/>
+            <w:r>
+              <w:rPr>
+                <w:lang w:val="pt-BR"/>
+              </w:rPr>
+              <w:t>Spawns</w:t>
+            </w:r>
+            <w:proofErr w:type="spellEnd"/>
+            <w:r>
+              <w:rPr>
+                <w:lang w:val="pt-BR"/>
+              </w:rPr>
+              <w:t xml:space="preserve"> de recursos secundários que iniciam um Timer autônomo para alterar propriedades do jogador (velocidade) ou globais (</w:t>
+            </w:r>
+            <w:proofErr w:type="spellStart"/>
+            <w:r>
+              <w:rPr>
+                <w:lang w:val="pt-BR"/>
+              </w:rPr>
+              <w:t>taxa_decaimento</w:t>
+            </w:r>
+            <w:proofErr w:type="spellEnd"/>
+            <w:r>
+              <w:rPr>
+                <w:lang w:val="pt-BR"/>
+              </w:rPr>
+              <w:t>).</w:t>
+            </w:r>
+          </w:p>
+        </w:tc>
+      </w:tr>
+      <w:tr>
+        <w:trPr>
+          <w:trHeight w:val="1275"/>
+        </w:trPr>
+        <w:tc>
+          <w:tcPr>
+            <w:tcW w:w="2884" w:type="dxa"/>
+          </w:tcPr>
+          <w:p>
+            <w:pPr>
+              <w:rPr>
+                <w:lang w:val="pt-BR"/>
+              </w:rPr>
+            </w:pPr>
+            <w:r>
+              <w:rPr>
+                <w:lang w:val="pt-BR"/>
+              </w:rPr>
+              <w:t>#24</w:t>
+            </w:r>
+          </w:p>
+        </w:tc>
+        <w:tc>
+          <w:tcPr>
+            <w:tcW w:w="2884" w:type="dxa"/>
+          </w:tcPr>
+          <w:p>
+            <w:pPr>
+              <w:rPr>
+                <w:lang w:val="pt-BR"/>
+              </w:rPr>
+            </w:pPr>
+            <w:r>
+              <w:rPr>
+                <w:lang w:val="pt-BR"/>
+              </w:rPr>
+              <w:t>Gestão de Resolução (UI/UX)</w:t>
+            </w:r>
+          </w:p>
+        </w:tc>
+        <w:tc>
+          <w:tcPr>
+            <w:tcW w:w="2884" w:type="dxa"/>
+          </w:tcPr>
+          <w:p>
+            <w:pPr>
+              <w:rPr>
+                <w:lang w:val="pt-BR"/>
+              </w:rPr>
+            </w:pPr>
+            <w:r>
+              <w:rPr>
+                <w:lang w:val="pt-BR"/>
+              </w:rPr>
+              <w:t xml:space="preserve">Configuração do </w:t>
+            </w:r>
+            <w:r>
+              <w:rPr>
+                <w:i/>
+                <w:iCs/>
+                <w:lang w:val="pt-BR"/>
+              </w:rPr>
+              <w:t>Project Settings</w:t>
+            </w:r>
+            <w:r>
+              <w:rPr>
+                <w:lang w:val="pt-BR"/>
+              </w:rPr>
+              <w:t xml:space="preserve"> (</w:t>
+            </w:r>
+            <w:proofErr w:type="spellStart"/>
+            <w:r>
+              <w:rPr>
+                <w:lang w:val="pt-BR"/>
+              </w:rPr>
+              <w:t>Window</w:t>
+            </w:r>
+            <w:proofErr w:type="spellEnd"/>
+            <w:r>
+              <w:rPr>
+                <w:lang w:val="pt-BR"/>
+              </w:rPr>
+              <w:t xml:space="preserve"> &gt; </w:t>
+            </w:r>
+            <w:proofErr w:type="spellStart"/>
+            <w:r>
+              <w:rPr>
+                <w:lang w:val="pt-BR"/>
+              </w:rPr>
+              <w:t>Stretch</w:t>
+            </w:r>
+            <w:proofErr w:type="spellEnd"/>
+            <w:r>
+              <w:rPr>
+                <w:lang w:val="pt-BR"/>
+              </w:rPr>
+              <w:t xml:space="preserve"> &gt; </w:t>
+            </w:r>
+            <w:proofErr w:type="spellStart"/>
+            <w:r>
+              <w:rPr>
+                <w:lang w:val="pt-BR"/>
+              </w:rPr>
+              <w:t>Mode</w:t>
+            </w:r>
+            <w:proofErr w:type="spellEnd"/>
+            <w:r>
+              <w:rPr>
+                <w:lang w:val="pt-BR"/>
+              </w:rPr>
+              <w:t xml:space="preserve">: </w:t>
+            </w:r>
+            <w:proofErr w:type="spellStart"/>
+            <w:r>
+              <w:rPr>
+                <w:lang w:val="pt-BR"/>
+              </w:rPr>
+              <w:t>canvas_items</w:t>
+            </w:r>
+            <w:proofErr w:type="spellEnd"/>
+            <w:r>
+              <w:rPr>
+                <w:lang w:val="pt-BR"/>
+              </w:rPr>
+              <w:t xml:space="preserve"> e </w:t>
+            </w:r>
+            <w:proofErr w:type="spellStart"/>
+            <w:r>
+              <w:rPr>
+                <w:lang w:val="pt-BR"/>
+              </w:rPr>
+              <w:t>Aspect</w:t>
+            </w:r>
+            <w:proofErr w:type="spellEnd"/>
+            <w:r>
+              <w:rPr>
+                <w:lang w:val="pt-BR"/>
+              </w:rPr>
+              <w:t xml:space="preserve">: </w:t>
+            </w:r>
+            <w:proofErr w:type="spellStart"/>
+            <w:r>
+              <w:rPr>
+                <w:lang w:val="pt-BR"/>
+              </w:rPr>
+              <w:t>keep</w:t>
+            </w:r>
+            <w:proofErr w:type="spellEnd"/>
+            <w:r>
+              <w:rPr>
+                <w:lang w:val="pt-BR"/>
+              </w:rPr>
+              <w:t xml:space="preserve">) para garantir escalonamento correto do </w:t>
+            </w:r>
+            <w:r>
+              <w:rPr>
+                <w:lang w:val="pt-BR"/>
+              </w:rPr>
+              <w:lastRenderedPageBreak/>
+              <w:t>HUD e arena em diferentes monitores.</w:t>
+            </w:r>
+          </w:p>
+        </w:tc>
+      </w:tr>
+      <w:tr>
+        <w:trPr>
+          <w:trHeight w:val="1275"/>
+        </w:trPr>
+        <w:tc>
+          <w:tcPr>
+            <w:tcW w:w="2884" w:type="dxa"/>
+          </w:tcPr>
+          <w:p>
+            <w:pPr>
+              <w:rPr>
+                <w:lang w:val="pt-BR"/>
+              </w:rPr>
+            </w:pPr>
+          </w:p>
+        </w:tc>
+        <w:tc>
+          <w:tcPr>
+            <w:tcW w:w="2884" w:type="dxa"/>
+          </w:tcPr>
+          <w:p>
+            <w:pPr>
+              <w:rPr>
+                <w:lang w:val="pt-BR"/>
+              </w:rPr>
+            </w:pPr>
+          </w:p>
+        </w:tc>
+        <w:tc>
+          <w:tcPr>
+            <w:tcW w:w="2884" w:type="dxa"/>
+          </w:tcPr>
+          <w:p>
+            <w:pPr>
+              <w:rPr>
+                <w:lang w:val="pt-BR"/>
+              </w:rPr>
+            </w:pPr>
+          </w:p>
+        </w:tc>
+      </w:tr>
+      <w:tr>
+        <w:trPr>
+          <w:trHeight w:val="1275"/>
+        </w:trPr>
+        <w:tc>
+          <w:tcPr>
+            <w:tcW w:w="2884" w:type="dxa"/>
+          </w:tcPr>
+          <w:p>
+            <w:pPr>
+              <w:rPr>
+                <w:lang w:val="pt-BR"/>
+              </w:rPr>
+            </w:pPr>
+          </w:p>
+        </w:tc>
+        <w:tc>
+          <w:tcPr>
+            <w:tcW w:w="2884" w:type="dxa"/>
+          </w:tcPr>
+          <w:p>
+            <w:pPr>
+              <w:rPr>
+                <w:lang w:val="pt-BR"/>
+              </w:rPr>
+            </w:pPr>
+          </w:p>
+        </w:tc>
+        <w:tc>
+          <w:tcPr>
+            <w:tcW w:w="2884" w:type="dxa"/>
+          </w:tcPr>
+          <w:p>
+            <w:pPr>
+              <w:rPr>
+                <w:lang w:val="pt-BR"/>
+              </w:rPr>
+            </w:pPr>
+          </w:p>
+        </w:tc>
+      </w:tr>
+      <w:tr>
+        <w:trPr>
+          <w:trHeight w:val="1275"/>
+        </w:trPr>
+        <w:tc>
+          <w:tcPr>
+            <w:tcW w:w="2884" w:type="dxa"/>
+          </w:tcPr>
+          <w:p>
+            <w:pPr>
+              <w:rPr>
+                <w:lang w:val="pt-BR"/>
+              </w:rPr>
+            </w:pPr>
+          </w:p>
+        </w:tc>
+        <w:tc>
+          <w:tcPr>
+            <w:tcW w:w="2884" w:type="dxa"/>
+          </w:tcPr>
+          <w:p>
+            <w:pPr>
+              <w:rPr>
+                <w:lang w:val="pt-BR"/>
+              </w:rPr>
+            </w:pPr>
+          </w:p>
+        </w:tc>
+        <w:tc>
+          <w:tcPr>
+            <w:tcW w:w="2884" w:type="dxa"/>
+          </w:tcPr>
+          <w:p>
+            <w:pPr>
+              <w:rPr>
+                <w:lang w:val="pt-BR"/>
+              </w:rPr>
+            </w:pPr>
+          </w:p>
+        </w:tc>
+      </w:tr>
+      <w:tr>
+        <w:trPr>
+          <w:trHeight w:val="1275"/>
+        </w:trPr>
+        <w:tc>
+          <w:tcPr>
+            <w:tcW w:w="2884" w:type="dxa"/>
+          </w:tcPr>
+          <w:p>
+            <w:pPr>
+              <w:rPr>
+                <w:lang w:val="pt-BR"/>
+              </w:rPr>
+            </w:pPr>
+          </w:p>
+        </w:tc>
+        <w:tc>
+          <w:tcPr>
+            <w:tcW w:w="2884" w:type="dxa"/>
+          </w:tcPr>
+          <w:p>
+            <w:pPr>
+              <w:rPr>
+                <w:lang w:val="pt-BR"/>
+              </w:rPr>
+            </w:pPr>
+          </w:p>
+        </w:tc>
+        <w:tc>
+          <w:tcPr>
+            <w:tcW w:w="2884" w:type="dxa"/>
+          </w:tcPr>
+          <w:p>
+            <w:pPr>
+              <w:rPr>
+                <w:lang w:val="pt-BR"/>
+              </w:rPr>
+            </w:pPr>
+          </w:p>
+        </w:tc>
+      </w:tr>
+      <w:tr>
+        <w:trPr>
+          <w:trHeight w:val="1275"/>
+        </w:trPr>
+        <w:tc>
+          <w:tcPr>
+            <w:tcW w:w="2884" w:type="dxa"/>
+          </w:tcPr>
+          <w:p>
+            <w:pPr>
+              <w:rPr>
+                <w:lang w:val="pt-BR"/>
+              </w:rPr>
+            </w:pPr>
+          </w:p>
+        </w:tc>
+        <w:tc>
+          <w:tcPr>
+            <w:tcW w:w="2884" w:type="dxa"/>
+          </w:tcPr>
+          <w:p>
+            <w:pPr>
+              <w:rPr>
+                <w:lang w:val="pt-BR"/>
+              </w:rPr>
+            </w:pPr>
+          </w:p>
+        </w:tc>
+        <w:tc>
+          <w:tcPr>
+            <w:tcW w:w="2884" w:type="dxa"/>
+          </w:tcPr>
+          <w:p>
+            <w:pPr>
+              <w:rPr>
+                <w:lang w:val="pt-BR"/>
+              </w:rPr>
+            </w:pPr>
+          </w:p>
+        </w:tc>
+      </w:tr>
+      <w:tr>
+        <w:trPr>
+          <w:trHeight w:val="1275"/>
+        </w:trPr>
+        <w:tc>
+          <w:tcPr>
+            <w:tcW w:w="2884" w:type="dxa"/>
+          </w:tcPr>
+          <w:p>
+            <w:pPr>
+              <w:rPr>
+                <w:lang w:val="pt-BR"/>
+              </w:rPr>
+            </w:pPr>
+          </w:p>
+        </w:tc>
+        <w:tc>
+          <w:tcPr>
+            <w:tcW w:w="2884" w:type="dxa"/>
+          </w:tcPr>
+          <w:p>
+            <w:pPr>
+              <w:rPr>
+                <w:lang w:val="pt-BR"/>
+              </w:rPr>
+            </w:pPr>
+          </w:p>
+        </w:tc>
+        <w:tc>
+          <w:tcPr>
+            <w:tcW w:w="2884" w:type="dxa"/>
+          </w:tcPr>
+          <w:p>
+            <w:pPr>
+              <w:rPr>
+                <w:lang w:val="pt-BR"/>
+              </w:rPr>
+            </w:pPr>
+          </w:p>
+        </w:tc>
+      </w:tr>
+      <w:tr>
+        <w:trPr>
+          <w:trHeight w:val="1275"/>
+        </w:trPr>
+        <w:tc>
+          <w:tcPr>
+            <w:tcW w:w="2884" w:type="dxa"/>
+          </w:tcPr>
+          <w:p>
+            <w:pPr>
+              <w:rPr>
+                <w:lang w:val="pt-BR"/>
+              </w:rPr>
+            </w:pPr>
+          </w:p>
+        </w:tc>
+        <w:tc>
+          <w:tcPr>
+            <w:tcW w:w="2884" w:type="dxa"/>
+          </w:tcPr>
+          <w:p>
+            <w:pPr>
+              <w:rPr>
+                <w:lang w:val="pt-BR"/>
+              </w:rPr>
+            </w:pPr>
+          </w:p>
+        </w:tc>
+        <w:tc>
+          <w:tcPr>
+            <w:tcW w:w="2884" w:type="dxa"/>
+          </w:tcPr>
+          <w:p>
+            <w:pPr>
+              <w:rPr>
+                <w:lang w:val="pt-BR"/>
+              </w:rPr>
+            </w:pPr>
+          </w:p>
+        </w:tc>
+      </w:tr>
+      <w:tr>
+        <w:trPr>
+          <w:trHeight w:val="1275"/>
+        </w:trPr>
+        <w:tc>
+          <w:tcPr>
+            <w:tcW w:w="2884" w:type="dxa"/>
+          </w:tcPr>
+          <w:p>
+            <w:pPr>
+              <w:rPr>
+                <w:lang w:val="pt-BR"/>
+              </w:rPr>
+            </w:pPr>
+          </w:p>
+        </w:tc>
+        <w:tc>
+          <w:tcPr>
+            <w:tcW w:w="2884" w:type="dxa"/>
+          </w:tcPr>
+          <w:p>
+            <w:pPr>
+              <w:rPr>
+                <w:lang w:val="pt-BR"/>
+              </w:rPr>
+            </w:pPr>
+          </w:p>
+        </w:tc>
+        <w:tc>
+          <w:tcPr>
+            <w:tcW w:w="2884" w:type="dxa"/>
+          </w:tcPr>
+          <w:p>
+            <w:pPr>
+              <w:rPr>
+                <w:lang w:val="pt-BR"/>
+              </w:rPr>
+            </w:pPr>
+          </w:p>
+        </w:tc>
+      </w:tr>
+      <w:tr>
+        <w:trPr>
+          <w:trHeight w:val="1275"/>
+        </w:trPr>
+        <w:tc>
+          <w:tcPr>
+            <w:tcW w:w="2884" w:type="dxa"/>
+          </w:tcPr>
+          <w:p>
+            <w:pPr>
+              <w:rPr>
+                <w:lang w:val="pt-BR"/>
+              </w:rPr>
+            </w:pPr>
+          </w:p>
+        </w:tc>
+        <w:tc>
+          <w:tcPr>
+            <w:tcW w:w="2884" w:type="dxa"/>
+          </w:tcPr>
+          <w:p>
+            <w:pPr>
+              <w:rPr>
+                <w:lang w:val="pt-BR"/>
+              </w:rPr>
+            </w:pPr>
+          </w:p>
+        </w:tc>
+        <w:tc>
+          <w:tcPr>
+            <w:tcW w:w="2884" w:type="dxa"/>
+          </w:tcPr>
+          <w:p>
+            <w:pPr>
+              <w:rPr>
+                <w:lang w:val="pt-BR"/>
+              </w:rPr>
+            </w:pPr>
+          </w:p>
+        </w:tc>
+      </w:tr>
+      <w:tr>
+        <w:trPr>
+          <w:trHeight w:val="1275"/>
+        </w:trPr>
+        <w:tc>
+          <w:tcPr>
+            <w:tcW w:w="2884" w:type="dxa"/>
+          </w:tcPr>
+          <w:p>
+            <w:pPr>
+              <w:rPr>
+                <w:lang w:val="pt-BR"/>
+              </w:rPr>
+            </w:pPr>
+          </w:p>
+        </w:tc>
+        <w:tc>
+          <w:tcPr>
+            <w:tcW w:w="2884" w:type="dxa"/>
+          </w:tcPr>
+          <w:p>
+            <w:pPr>
+              <w:rPr>
+                <w:lang w:val="pt-BR"/>
+              </w:rPr>
+            </w:pPr>
+          </w:p>
+        </w:tc>
+        <w:tc>
+          <w:tcPr>
+            <w:tcW w:w="2884" w:type="dxa"/>
+          </w:tcPr>
+          <w:p>
+            <w:pPr>
+              <w:rPr>
+                <w:lang w:val="pt-BR"/>
+              </w:rPr>
+            </w:pPr>
+          </w:p>
+        </w:tc>
+      </w:tr>
+      <w:tr>
+        <w:trPr>
+          <w:trHeight w:val="1275"/>
+        </w:trPr>
+        <w:tc>
+          <w:tcPr>
+            <w:tcW w:w="2884" w:type="dxa"/>
+          </w:tcPr>
+          <w:p>
+            <w:pPr>
+              <w:rPr>
+                <w:lang w:val="pt-BR"/>
+              </w:rPr>
+            </w:pPr>
+          </w:p>
+        </w:tc>
+        <w:tc>
+          <w:tcPr>
+            <w:tcW w:w="2884" w:type="dxa"/>
+          </w:tcPr>
+          <w:p>
+            <w:pPr>
+              <w:rPr>
+                <w:lang w:val="pt-BR"/>
+              </w:rPr>
+            </w:pPr>
+          </w:p>
+        </w:tc>
+        <w:tc>
+          <w:tcPr>
+            <w:tcW w:w="2884" w:type="dxa"/>
+          </w:tcPr>
+          <w:p>
+            <w:pPr>
+              <w:rPr>
+                <w:lang w:val="pt-BR"/>
+              </w:rPr>
+            </w:pPr>
           </w:p>
         </w:tc>
       </w:tr>

</xml_diff>